<commit_message>
Update KEFFI_REPORT_1_FINAL_MODIFIED.docx with user's exact uploaded 5 live screenshots (Hero, Silent Crisis, Why Keffi, Clinical Research, Tech Stack)
</commit_message>
<xml_diff>
--- a/Presentations_and_Extracted_Media/KEFFI_REPORT_1_FINAL_MODIFIED.docx
+++ b/Presentations_and_Extracted_Media/KEFFI_REPORT_1_FINAL_MODIFIED.docx
@@ -598,7 +598,7 @@
           <w:color w:val="1E1E1E"/>
           <w:sz w:val="24"/>
         </w:rPr>
-        <w:t xml:space="preserve">  4.2 Use Case Analysis for Model Development ......................................... 20</w:t>
+        <w:t xml:space="preserve">  4.2 Use Case Analysis for Model Development ................................. catalog 20</w:t>
       </w:r>
     </w:p>
     <w:p>
@@ -1955,7 +1955,7 @@
           <w:color w:val="3A7070"/>
           <w:sz w:val="24"/>
         </w:rPr>
-        <w:t>Landing Page Interface</w:t>
+        <w:t>Landing Page Hero Interface</w:t>
       </w:r>
     </w:p>
     <w:p>
@@ -1965,7 +1965,7 @@
       <w:r>
         <w:drawing>
           <wp:inline xmlns:a="http://schemas.openxmlformats.org/drawingml/2006/main" xmlns:pic="http://schemas.openxmlformats.org/drawingml/2006/picture">
-            <wp:extent cx="5303520" cy="2983230"/>
+            <wp:extent cx="5303520" cy="2176653"/>
             <wp:docPr id="3" name="Picture 3"/>
             <wp:cNvGraphicFramePr>
               <a:graphicFrameLocks noChangeAspect="1"/>
@@ -1974,7 +1974,7 @@
               <a:graphicData uri="http://schemas.openxmlformats.org/drawingml/2006/picture">
                 <pic:pic>
                   <pic:nvPicPr>
-                    <pic:cNvPr id="0" name="page_92_img_1.png"/>
+                    <pic:cNvPr id="0" name="user_screenshot_1_hero.png"/>
                     <pic:cNvPicPr/>
                   </pic:nvPicPr>
                   <pic:blipFill>
@@ -1986,7 +1986,7 @@
                   <pic:spPr>
                     <a:xfrm>
                       <a:off x="0" y="0"/>
-                      <a:ext cx="5303520" cy="2983230"/>
+                      <a:ext cx="5303520" cy="2176653"/>
                     </a:xfrm>
                     <a:prstGeom prst="rect"/>
                   </pic:spPr>
@@ -2010,7 +2010,7 @@
           <w:color w:val="3A7070"/>
           <w:sz w:val="24"/>
         </w:rPr>
-        <w:t>Keffi Chatting Page (Sanctuary Interface with Hands-Free Voice Mode)</w:t>
+        <w:t>The Silent Crisis We Ignore (The 167-Hour Gap)</w:t>
       </w:r>
     </w:p>
     <w:p>
@@ -2020,7 +2020,7 @@
       <w:r>
         <w:drawing>
           <wp:inline xmlns:a="http://schemas.openxmlformats.org/drawingml/2006/main" xmlns:pic="http://schemas.openxmlformats.org/drawingml/2006/picture">
-            <wp:extent cx="5303520" cy="2983230"/>
+            <wp:extent cx="5303520" cy="2176653"/>
             <wp:docPr id="4" name="Picture 4"/>
             <wp:cNvGraphicFramePr>
               <a:graphicFrameLocks noChangeAspect="1"/>
@@ -2029,7 +2029,62 @@
               <a:graphicData uri="http://schemas.openxmlformats.org/drawingml/2006/picture">
                 <pic:pic>
                   <pic:nvPicPr>
-                    <pic:cNvPr id="0" name="page_92_img_2.png"/>
+                    <pic:cNvPr id="0" name="user_screenshot_1_hero.png"/>
+                    <pic:cNvPicPr/>
+                  </pic:nvPicPr>
+                  <pic:blipFill>
+                    <a:blip r:embed="rId11"/>
+                    <a:stretch>
+                      <a:fillRect/>
+                    </a:stretch>
+                  </pic:blipFill>
+                  <pic:spPr>
+                    <a:xfrm>
+                      <a:off x="0" y="0"/>
+                      <a:ext cx="5303520" cy="2176653"/>
+                    </a:xfrm>
+                    <a:prstGeom prst="rect"/>
+                  </pic:spPr>
+                </pic:pic>
+              </a:graphicData>
+            </a:graphic>
+          </wp:inline>
+        </w:drawing>
+      </w:r>
+    </w:p>
+    <w:p>
+      <w:pPr>
+        <w:pStyle w:val="Heading3"/>
+        <w:spacing w:before="200" w:after="80"/>
+        <w:jc w:val="left"/>
+      </w:pPr>
+      <w:r>
+        <w:rPr>
+          <w:rFonts w:ascii="Times New Roman" w:hAnsi="Times New Roman"/>
+          <w:b/>
+          <w:color w:val="3A7070"/>
+          <w:sz w:val="24"/>
+        </w:rPr>
+        <w:t>Why Keffi Was Created (Global Care Gap Evidence)</w:t>
+      </w:r>
+    </w:p>
+    <w:p>
+      <w:pPr>
+        <w:jc w:val="center"/>
+      </w:pPr>
+      <w:r>
+        <w:drawing>
+          <wp:inline xmlns:a="http://schemas.openxmlformats.org/drawingml/2006/main" xmlns:pic="http://schemas.openxmlformats.org/drawingml/2006/picture">
+            <wp:extent cx="5303520" cy="2734627"/>
+            <wp:docPr id="5" name="Picture 5"/>
+            <wp:cNvGraphicFramePr>
+              <a:graphicFrameLocks noChangeAspect="1"/>
+            </wp:cNvGraphicFramePr>
+            <a:graphic>
+              <a:graphicData uri="http://schemas.openxmlformats.org/drawingml/2006/picture">
+                <pic:pic>
+                  <pic:nvPicPr>
+                    <pic:cNvPr id="0" name="user_screenshot_3_why_created.png"/>
                     <pic:cNvPicPr/>
                   </pic:nvPicPr>
                   <pic:blipFill>
@@ -2041,7 +2096,7 @@
                   <pic:spPr>
                     <a:xfrm>
                       <a:off x="0" y="0"/>
-                      <a:ext cx="5303520" cy="2983230"/>
+                      <a:ext cx="5303520" cy="2734627"/>
                     </a:xfrm>
                     <a:prstGeom prst="rect"/>
                   </pic:spPr>
@@ -2065,7 +2120,7 @@
           <w:color w:val="3A7070"/>
           <w:sz w:val="24"/>
         </w:rPr>
-        <w:t>Admin Clinical Hub Dashboard &amp; Complete Transcript Inspector</w:t>
+        <w:t>Clinical Research &amp; Psychological Foundations</w:t>
       </w:r>
     </w:p>
     <w:p>
@@ -2075,8 +2130,8 @@
       <w:r>
         <w:drawing>
           <wp:inline xmlns:a="http://schemas.openxmlformats.org/drawingml/2006/main" xmlns:pic="http://schemas.openxmlformats.org/drawingml/2006/picture">
-            <wp:extent cx="5303520" cy="2983230"/>
-            <wp:docPr id="5" name="Picture 5"/>
+            <wp:extent cx="5303520" cy="2734627"/>
+            <wp:docPr id="6" name="Picture 6"/>
             <wp:cNvGraphicFramePr>
               <a:graphicFrameLocks noChangeAspect="1"/>
             </wp:cNvGraphicFramePr>
@@ -2084,7 +2139,7 @@
               <a:graphicData uri="http://schemas.openxmlformats.org/drawingml/2006/picture">
                 <pic:pic>
                   <pic:nvPicPr>
-                    <pic:cNvPr id="0" name="page_96_img_1.png"/>
+                    <pic:cNvPr id="0" name="user_screenshot_4_clinical_models.png"/>
                     <pic:cNvPicPr/>
                   </pic:nvPicPr>
                   <pic:blipFill>
@@ -2096,7 +2151,7 @@
                   <pic:spPr>
                     <a:xfrm>
                       <a:off x="0" y="0"/>
-                      <a:ext cx="5303520" cy="2983230"/>
+                      <a:ext cx="5303520" cy="2734627"/>
                     </a:xfrm>
                     <a:prstGeom prst="rect"/>
                   </pic:spPr>
@@ -2120,7 +2175,62 @@
           <w:color w:val="3A7070"/>
           <w:sz w:val="24"/>
         </w:rPr>
-        <w:t>Official Project Poster &amp; DeepTech System Architecture Asset</w:t>
+        <w:t>Full-Stack Production-Ready Architecture &amp; Module Stack</w:t>
+      </w:r>
+    </w:p>
+    <w:p>
+      <w:pPr>
+        <w:jc w:val="center"/>
+      </w:pPr>
+      <w:r>
+        <w:drawing>
+          <wp:inline xmlns:a="http://schemas.openxmlformats.org/drawingml/2006/main" xmlns:pic="http://schemas.openxmlformats.org/drawingml/2006/picture">
+            <wp:extent cx="5303520" cy="2734627"/>
+            <wp:docPr id="7" name="Picture 7"/>
+            <wp:cNvGraphicFramePr>
+              <a:graphicFrameLocks noChangeAspect="1"/>
+            </wp:cNvGraphicFramePr>
+            <a:graphic>
+              <a:graphicData uri="http://schemas.openxmlformats.org/drawingml/2006/picture">
+                <pic:pic>
+                  <pic:nvPicPr>
+                    <pic:cNvPr id="0" name="user_screenshot_5_tech_stack.png"/>
+                    <pic:cNvPicPr/>
+                  </pic:nvPicPr>
+                  <pic:blipFill>
+                    <a:blip r:embed="rId14"/>
+                    <a:stretch>
+                      <a:fillRect/>
+                    </a:stretch>
+                  </pic:blipFill>
+                  <pic:spPr>
+                    <a:xfrm>
+                      <a:off x="0" y="0"/>
+                      <a:ext cx="5303520" cy="2734627"/>
+                    </a:xfrm>
+                    <a:prstGeom prst="rect"/>
+                  </pic:spPr>
+                </pic:pic>
+              </a:graphicData>
+            </a:graphic>
+          </wp:inline>
+        </w:drawing>
+      </w:r>
+    </w:p>
+    <w:p>
+      <w:pPr>
+        <w:pStyle w:val="Heading3"/>
+        <w:spacing w:before="200" w:after="80"/>
+        <w:jc w:val="left"/>
+      </w:pPr>
+      <w:r>
+        <w:rPr>
+          <w:rFonts w:ascii="Times New Roman" w:hAnsi="Times New Roman"/>
+          <w:b/>
+          <w:color w:val="3A7070"/>
+          <w:sz w:val="24"/>
+        </w:rPr>
+        <w:t>Official DeepTech System Architecture Poster</w:t>
       </w:r>
     </w:p>
     <w:p>
@@ -2131,7 +2241,7 @@
         <w:drawing>
           <wp:inline xmlns:a="http://schemas.openxmlformats.org/drawingml/2006/main" xmlns:pic="http://schemas.openxmlformats.org/drawingml/2006/picture">
             <wp:extent cx="4572000" cy="6858000"/>
-            <wp:docPr id="6" name="Picture 6"/>
+            <wp:docPr id="8" name="Picture 8"/>
             <wp:cNvGraphicFramePr>
               <a:graphicFrameLocks noChangeAspect="1"/>
             </wp:cNvGraphicFramePr>
@@ -2143,7 +2253,7 @@
                     <pic:cNvPicPr/>
                   </pic:nvPicPr>
                   <pic:blipFill>
-                    <a:blip r:embed="rId14"/>
+                    <a:blip r:embed="rId15"/>
                     <a:stretch>
                       <a:fillRect/>
                     </a:stretch>

</xml_diff>